<commit_message>
update the meeting content.doc
</commit_message>
<xml_diff>
--- a/project1/meetingContent.docx
+++ b/project1/meetingContent.docx
@@ -182,6 +182,46 @@
           <w:lang w:val="en-US"/>
         </w:rPr>
       </w:pPr>
+      <w:r>
+        <w:rPr>
+          <w:sz w:val="28"/>
+          <w:szCs w:val="28"/>
+          <w:lang w:val="en-US"/>
+        </w:rPr>
+        <w:fldChar w:fldCharType="begin"/>
+      </w:r>
+      <w:r>
+        <w:rPr>
+          <w:sz w:val="28"/>
+          <w:szCs w:val="28"/>
+          <w:lang w:val="en-US"/>
+        </w:rPr>
+        <w:instrText xml:space="preserve"> LINK </w:instrText>
+      </w:r>
+      <w:r>
+        <w:rPr>
+          <w:sz w:val="28"/>
+          <w:szCs w:val="28"/>
+          <w:lang w:val="en-US"/>
+        </w:rPr>
+        <w:instrText xml:space="preserve">Excel.Sheet.12 "D:\\fanshawe college\\3171_UI&amp;DataVisualization\\projects\\Info_3171_group_project\\project1\\Libray Color Options.xlsx"  </w:instrText>
+      </w:r>
+      <w:r>
+        <w:rPr>
+          <w:sz w:val="28"/>
+          <w:szCs w:val="28"/>
+          <w:lang w:val="en-US"/>
+        </w:rPr>
+        <w:instrText xml:space="preserve">\a \p \f 0 \* MERGEFORMAT </w:instrText>
+      </w:r>
+      <w:r>
+        <w:rPr>
+          <w:sz w:val="28"/>
+          <w:szCs w:val="28"/>
+          <w:lang w:val="en-US"/>
+        </w:rPr>
+        <w:fldChar w:fldCharType="separate"/>
+      </w:r>
       <w:r>
         <w:rPr>
           <w:sz w:val="28"/>
@@ -208,16 +248,19 @@
             <v:path o:extrusionok="f" gradientshapeok="t" o:connecttype="rect"/>
             <o:lock v:ext="edit" aspectratio="t"/>
           </v:shapetype>
-          <v:shape id="_x0000_i1035" type="#_x0000_t75" style="width:74.1pt;height:49.8pt" o:ole="">
+          <v:shape id="_x0000_i1025" type="#_x0000_t75" style="width:74.1pt;height:49.8pt" o:ole="">
             <v:imagedata r:id="rId5" o:title=""/>
           </v:shape>
-          <o:OLEObject Type="Link" ProgID="Excel.Sheet.12" ShapeID="_x0000_i1035" DrawAspect="Icon" r:id="rId6" UpdateMode="Always">
-            <o:LinkType>EnhancedMetaFile</o:LinkType>
-            <o:LockedField>false</o:LockedField>
-            <o:FieldCodes>\f 0 \* MERGEFORMAT</o:FieldCodes>
-          </o:OLEObject>
         </w:object>
       </w:r>
+      <w:r>
+        <w:rPr>
+          <w:sz w:val="28"/>
+          <w:szCs w:val="28"/>
+          <w:lang w:val="en-US"/>
+        </w:rPr>
+        <w:fldChar w:fldCharType="end"/>
+      </w:r>
     </w:p>
     <w:p>
       <w:pPr>
@@ -289,6 +332,7 @@
       </w:pPr>
       <w:r>
         <w:rPr>
+          <w:noProof/>
           <w:sz w:val="28"/>
           <w:szCs w:val="28"/>
           <w:lang w:val="en-US"/>
@@ -309,7 +353,7 @@
                     <pic:cNvPicPr/>
                   </pic:nvPicPr>
                   <pic:blipFill>
-                    <a:blip r:embed="rId7"/>
+                    <a:blip r:embed="rId6"/>
                     <a:stretch>
                       <a:fillRect/>
                     </a:stretch>
@@ -353,7 +397,23 @@
           <w:szCs w:val="32"/>
           <w:lang w:val="en-US"/>
         </w:rPr>
-        <w:t xml:space="preserve">Next meeting date: 11pm,10/28/2025 </w:t>
+        <w:t>Next meeting date: 11</w:t>
+      </w:r>
+      <w:r>
+        <w:rPr>
+          <w:sz w:val="32"/>
+          <w:szCs w:val="32"/>
+          <w:lang w:val="en-US"/>
+        </w:rPr>
+        <w:t>a</w:t>
+      </w:r>
+      <w:r>
+        <w:rPr>
+          <w:sz w:val="32"/>
+          <w:szCs w:val="32"/>
+          <w:lang w:val="en-US"/>
+        </w:rPr>
+        <w:t xml:space="preserve">m,10/28/2025 </w:t>
       </w:r>
     </w:p>
     <w:sectPr>
@@ -1306,6 +1366,18 @@
       <w:shd w:val="clear" w:color="auto" w:fill="E1DFDD"/>
     </w:rPr>
   </w:style>
+  <w:style w:type="character" w:styleId="FollowedHyperlink">
+    <w:name w:val="FollowedHyperlink"/>
+    <w:basedOn w:val="DefaultParagraphFont"/>
+    <w:uiPriority w:val="99"/>
+    <w:semiHidden/>
+    <w:unhideWhenUsed/>
+    <w:rsid w:val="00032985"/>
+    <w:rPr>
+      <w:color w:val="96607D" w:themeColor="followedHyperlink"/>
+      <w:u w:val="single"/>
+    </w:rPr>
+  </w:style>
 </w:styles>
 </file>
 

</xml_diff>

<commit_message>
feat: Update meeting content and add initial Typo spreadsheet
</commit_message>
<xml_diff>
--- a/project1/meetingContent.docx
+++ b/project1/meetingContent.docx
@@ -136,7 +136,7 @@
         </w:rPr>
         <w:t xml:space="preserve">AI designed UI: </w:t>
       </w:r>
-      <w:hyperlink r:id="rId4" w:history="1">
+      <w:hyperlink r:id="rId5" w:history="1">
         <w:r>
           <w:rPr>
             <w:rStyle w:val="Hyperlink"/>
@@ -182,46 +182,6 @@
           <w:lang w:val="en-US"/>
         </w:rPr>
       </w:pPr>
-      <w:r>
-        <w:rPr>
-          <w:sz w:val="28"/>
-          <w:szCs w:val="28"/>
-          <w:lang w:val="en-US"/>
-        </w:rPr>
-        <w:fldChar w:fldCharType="begin"/>
-      </w:r>
-      <w:r>
-        <w:rPr>
-          <w:sz w:val="28"/>
-          <w:szCs w:val="28"/>
-          <w:lang w:val="en-US"/>
-        </w:rPr>
-        <w:instrText xml:space="preserve"> LINK </w:instrText>
-      </w:r>
-      <w:r>
-        <w:rPr>
-          <w:sz w:val="28"/>
-          <w:szCs w:val="28"/>
-          <w:lang w:val="en-US"/>
-        </w:rPr>
-        <w:instrText xml:space="preserve">Excel.Sheet.12 "D:\\fanshawe college\\3171_UI&amp;DataVisualization\\projects\\Info_3171_group_project\\project1\\Libray Color Options.xlsx"  </w:instrText>
-      </w:r>
-      <w:r>
-        <w:rPr>
-          <w:sz w:val="28"/>
-          <w:szCs w:val="28"/>
-          <w:lang w:val="en-US"/>
-        </w:rPr>
-        <w:instrText xml:space="preserve">\a \p \f 0 \* MERGEFORMAT </w:instrText>
-      </w:r>
-      <w:r>
-        <w:rPr>
-          <w:sz w:val="28"/>
-          <w:szCs w:val="28"/>
-          <w:lang w:val="en-US"/>
-        </w:rPr>
-        <w:fldChar w:fldCharType="separate"/>
-      </w:r>
       <w:r>
         <w:rPr>
           <w:sz w:val="28"/>
@@ -249,17 +209,14 @@
             <o:lock v:ext="edit" aspectratio="t"/>
           </v:shapetype>
           <v:shape id="_x0000_i1025" type="#_x0000_t75" style="width:74.1pt;height:49.8pt" o:ole="">
-            <v:imagedata r:id="rId5" o:title=""/>
+            <v:imagedata r:id="rId6" o:title=""/>
           </v:shape>
+          <o:OLEObject Type="Link" ProgID="Excel.Sheet.12" ShapeID="_x0000_i1025" DrawAspect="Content" r:id="rId7" UpdateMode="Always">
+            <o:LinkType>EnhancedMetaFile</o:LinkType>
+            <o:LockedField>false</o:LockedField>
+            <o:FieldCodes>\f 0 \* MERGEFORMAT</o:FieldCodes>
+          </o:OLEObject>
         </w:object>
-      </w:r>
-      <w:r>
-        <w:rPr>
-          <w:sz w:val="28"/>
-          <w:szCs w:val="28"/>
-          <w:lang w:val="en-US"/>
-        </w:rPr>
-        <w:fldChar w:fldCharType="end"/>
       </w:r>
     </w:p>
     <w:p>
@@ -353,7 +310,7 @@
                     <pic:cNvPicPr/>
                   </pic:nvPicPr>
                   <pic:blipFill>
-                    <a:blip r:embed="rId6"/>
+                    <a:blip r:embed="rId8"/>
                     <a:stretch>
                       <a:fillRect/>
                     </a:stretch>
@@ -416,6 +373,604 @@
         <w:t xml:space="preserve">m,10/28/2025 </w:t>
       </w:r>
     </w:p>
+    <w:p>
+      <w:pPr>
+        <w:rPr>
+          <w:sz w:val="32"/>
+          <w:szCs w:val="32"/>
+          <w:lang w:val="en-US"/>
+        </w:rPr>
+      </w:pPr>
+      <w:r>
+        <w:rPr>
+          <w:sz w:val="32"/>
+          <w:szCs w:val="32"/>
+          <w:lang w:val="en-US"/>
+        </w:rPr>
+        <w:lastRenderedPageBreak/>
+        <w:t>Date: 10/28/2025</w:t>
+      </w:r>
+    </w:p>
+    <w:p>
+      <w:pPr>
+        <w:rPr>
+          <w:sz w:val="32"/>
+          <w:szCs w:val="32"/>
+          <w:lang w:val="en-US"/>
+        </w:rPr>
+      </w:pPr>
+      <w:r>
+        <w:rPr>
+          <w:sz w:val="32"/>
+          <w:szCs w:val="32"/>
+          <w:lang w:val="en-US"/>
+        </w:rPr>
+        <w:t>Group members: Haocheng, Mary, Pedro</w:t>
+      </w:r>
+    </w:p>
+    <w:p>
+      <w:pPr>
+        <w:rPr>
+          <w:sz w:val="32"/>
+          <w:szCs w:val="32"/>
+          <w:lang w:val="en-US"/>
+        </w:rPr>
+      </w:pPr>
+      <w:r>
+        <w:rPr>
+          <w:sz w:val="32"/>
+          <w:szCs w:val="32"/>
+          <w:lang w:val="en-US"/>
+        </w:rPr>
+        <w:t xml:space="preserve">Content: Discussed the project 1 requirements, UI lib looks and feels and </w:t>
+      </w:r>
+      <w:r>
+        <w:rPr>
+          <w:rFonts w:hint="eastAsia"/>
+          <w:sz w:val="32"/>
+          <w:szCs w:val="32"/>
+          <w:lang w:val="en-US"/>
+        </w:rPr>
+        <w:t>assigned the task for each group member.</w:t>
+      </w:r>
+    </w:p>
+    <w:p>
+      <w:pPr>
+        <w:rPr>
+          <w:sz w:val="32"/>
+          <w:szCs w:val="32"/>
+          <w:lang w:val="en-US"/>
+        </w:rPr>
+      </w:pPr>
+      <w:r>
+        <w:rPr>
+          <w:rFonts w:hint="eastAsia"/>
+          <w:sz w:val="32"/>
+          <w:szCs w:val="32"/>
+          <w:lang w:val="en-US"/>
+        </w:rPr>
+        <w:t>Outcomes:</w:t>
+      </w:r>
+    </w:p>
+    <w:p>
+      <w:pPr>
+        <w:rPr>
+          <w:sz w:val="32"/>
+          <w:szCs w:val="32"/>
+          <w:lang w:val="en-US"/>
+        </w:rPr>
+      </w:pPr>
+      <w:r>
+        <w:rPr>
+          <w:sz w:val="32"/>
+          <w:szCs w:val="32"/>
+          <w:lang w:val="en-US"/>
+        </w:rPr>
+        <w:t>UI chart design duty:</w:t>
+      </w:r>
+    </w:p>
+    <w:p>
+      <w:pPr>
+        <w:rPr>
+          <w:sz w:val="32"/>
+          <w:szCs w:val="32"/>
+          <w:lang w:val="en-US"/>
+        </w:rPr>
+      </w:pPr>
+      <w:r>
+        <w:rPr>
+          <w:sz w:val="32"/>
+          <w:szCs w:val="32"/>
+          <w:lang w:val="en-US"/>
+        </w:rPr>
+        <w:t xml:space="preserve">Mary: chart 1 -3 </w:t>
+      </w:r>
+    </w:p>
+    <w:p>
+      <w:pPr>
+        <w:rPr>
+          <w:sz w:val="32"/>
+          <w:szCs w:val="32"/>
+          <w:lang w:val="en-US"/>
+        </w:rPr>
+      </w:pPr>
+      <w:r>
+        <w:rPr>
+          <w:sz w:val="32"/>
+          <w:szCs w:val="32"/>
+          <w:lang w:val="en-US"/>
+        </w:rPr>
+        <w:t xml:space="preserve">Pedro: </w:t>
+      </w:r>
+      <w:r>
+        <w:rPr>
+          <w:sz w:val="32"/>
+          <w:szCs w:val="32"/>
+          <w:lang w:val="en-US"/>
+        </w:rPr>
+        <w:t xml:space="preserve">chart </w:t>
+      </w:r>
+      <w:r>
+        <w:rPr>
+          <w:sz w:val="32"/>
+          <w:szCs w:val="32"/>
+          <w:lang w:val="en-US"/>
+        </w:rPr>
+        <w:t>4-6</w:t>
+      </w:r>
+    </w:p>
+    <w:p>
+      <w:pPr>
+        <w:rPr>
+          <w:sz w:val="32"/>
+          <w:szCs w:val="32"/>
+          <w:lang w:val="en-US"/>
+        </w:rPr>
+      </w:pPr>
+      <w:r>
+        <w:rPr>
+          <w:sz w:val="32"/>
+          <w:szCs w:val="32"/>
+          <w:lang w:val="en-US"/>
+        </w:rPr>
+        <w:t xml:space="preserve">Haocheng: </w:t>
+      </w:r>
+      <w:r>
+        <w:rPr>
+          <w:sz w:val="32"/>
+          <w:szCs w:val="32"/>
+          <w:lang w:val="en-US"/>
+        </w:rPr>
+        <w:t xml:space="preserve">chart </w:t>
+      </w:r>
+      <w:r>
+        <w:rPr>
+          <w:sz w:val="32"/>
+          <w:szCs w:val="32"/>
+          <w:lang w:val="en-US"/>
+        </w:rPr>
+        <w:t>7- 9</w:t>
+      </w:r>
+    </w:p>
+    <w:p>
+      <w:pPr>
+        <w:rPr>
+          <w:sz w:val="32"/>
+          <w:szCs w:val="32"/>
+          <w:lang w:val="en-US"/>
+        </w:rPr>
+      </w:pPr>
+    </w:p>
+    <w:p>
+      <w:pPr>
+        <w:rPr>
+          <w:color w:val="EE0000"/>
+          <w:sz w:val="32"/>
+          <w:szCs w:val="32"/>
+          <w:lang w:val="en-US"/>
+        </w:rPr>
+      </w:pPr>
+      <w:r>
+        <w:rPr>
+          <w:sz w:val="32"/>
+          <w:szCs w:val="32"/>
+          <w:lang w:val="en-US"/>
+        </w:rPr>
+        <w:t>Pedro: Asking Professor if we can use Image(styled chart prototype) as placeholder for the chart, since we cannot code the styled chart so far</w:t>
+      </w:r>
+      <w:r>
+        <w:rPr>
+          <w:sz w:val="32"/>
+          <w:szCs w:val="32"/>
+          <w:lang w:val="en-US"/>
+        </w:rPr>
+        <w:t xml:space="preserve">  =&gt; </w:t>
+      </w:r>
+      <w:r>
+        <w:rPr>
+          <w:color w:val="EE0000"/>
+          <w:sz w:val="32"/>
+          <w:szCs w:val="32"/>
+          <w:highlight w:val="yellow"/>
+          <w:lang w:val="en-US"/>
+        </w:rPr>
+        <w:t>done, just use image as placeholder!!!</w:t>
+      </w:r>
+    </w:p>
+    <w:p>
+      <w:pPr>
+        <w:rPr>
+          <w:color w:val="EE0000"/>
+          <w:sz w:val="32"/>
+          <w:szCs w:val="32"/>
+          <w:lang w:val="en-US"/>
+        </w:rPr>
+      </w:pPr>
+    </w:p>
+    <w:p>
+      <w:pPr>
+        <w:rPr>
+          <w:sz w:val="32"/>
+          <w:szCs w:val="32"/>
+          <w:lang w:val="en-US"/>
+        </w:rPr>
+      </w:pPr>
+      <w:r>
+        <w:rPr>
+          <w:sz w:val="32"/>
+          <w:szCs w:val="32"/>
+          <w:lang w:val="en-US"/>
+        </w:rPr>
+        <w:t>Haocheng: double check the color with the color theme</w:t>
+      </w:r>
+    </w:p>
+    <w:p>
+      <w:pPr>
+        <w:rPr>
+          <w:sz w:val="32"/>
+          <w:szCs w:val="32"/>
+          <w:lang w:val="en-US"/>
+        </w:rPr>
+      </w:pPr>
+      <w:r>
+        <w:rPr>
+          <w:sz w:val="32"/>
+          <w:szCs w:val="32"/>
+          <w:lang w:val="en-US"/>
+        </w:rPr>
+        <w:t>Haocheng: structural of the UI lib</w:t>
+      </w:r>
+    </w:p>
+    <w:p>
+      <w:pPr>
+        <w:rPr>
+          <w:sz w:val="32"/>
+          <w:szCs w:val="32"/>
+          <w:lang w:val="en-US"/>
+        </w:rPr>
+      </w:pPr>
+      <w:r>
+        <w:rPr>
+          <w:sz w:val="32"/>
+          <w:szCs w:val="32"/>
+          <w:lang w:val="en-US"/>
+        </w:rPr>
+        <w:t>P</w:t>
+      </w:r>
+      <w:r>
+        <w:rPr>
+          <w:sz w:val="32"/>
+          <w:szCs w:val="32"/>
+          <w:lang w:val="en-US"/>
+        </w:rPr>
+        <w:t>e</w:t>
+      </w:r>
+      <w:r>
+        <w:rPr>
+          <w:sz w:val="32"/>
+          <w:szCs w:val="32"/>
+          <w:lang w:val="en-US"/>
+        </w:rPr>
+        <w:t>dro: colors content, and elements content</w:t>
+      </w:r>
+    </w:p>
+    <w:p>
+      <w:pPr>
+        <w:rPr>
+          <w:sz w:val="32"/>
+          <w:szCs w:val="32"/>
+          <w:lang w:val="en-US"/>
+        </w:rPr>
+      </w:pPr>
+      <w:r>
+        <w:rPr>
+          <w:sz w:val="32"/>
+          <w:szCs w:val="32"/>
+          <w:lang w:val="en-US"/>
+        </w:rPr>
+        <w:t>Mary: content of the typography</w:t>
+      </w:r>
+    </w:p>
+    <w:p>
+      <w:pPr>
+        <w:rPr>
+          <w:sz w:val="32"/>
+          <w:szCs w:val="32"/>
+          <w:lang w:val="en-US"/>
+        </w:rPr>
+      </w:pPr>
+    </w:p>
+    <w:p>
+      <w:pPr>
+        <w:rPr>
+          <w:sz w:val="32"/>
+          <w:szCs w:val="32"/>
+          <w:lang w:val="en-US"/>
+        </w:rPr>
+      </w:pPr>
+    </w:p>
+    <w:p>
+      <w:pPr>
+        <w:rPr>
+          <w:sz w:val="32"/>
+          <w:szCs w:val="32"/>
+          <w:lang w:val="en-US"/>
+        </w:rPr>
+      </w:pPr>
+    </w:p>
+    <w:p>
+      <w:pPr>
+        <w:rPr>
+          <w:sz w:val="32"/>
+          <w:szCs w:val="32"/>
+          <w:lang w:val="en-US"/>
+        </w:rPr>
+      </w:pPr>
+    </w:p>
+    <w:p>
+      <w:pPr>
+        <w:rPr>
+          <w:sz w:val="32"/>
+          <w:szCs w:val="32"/>
+          <w:lang w:val="en-US"/>
+        </w:rPr>
+      </w:pPr>
+      <w:r>
+        <w:rPr>
+          <w:sz w:val="32"/>
+          <w:szCs w:val="32"/>
+          <w:lang w:val="en-US"/>
+        </w:rPr>
+        <w:lastRenderedPageBreak/>
+        <w:t>C</w:t>
+      </w:r>
+      <w:r>
+        <w:rPr>
+          <w:rFonts w:hint="eastAsia"/>
+          <w:sz w:val="32"/>
+          <w:szCs w:val="32"/>
+          <w:lang w:val="en-US"/>
+        </w:rPr>
+        <w:t>SS</w:t>
+      </w:r>
+      <w:r>
+        <w:rPr>
+          <w:sz w:val="32"/>
+          <w:szCs w:val="32"/>
+          <w:lang w:val="en-US"/>
+        </w:rPr>
+        <w:t xml:space="preserve"> class conversion: </w:t>
+      </w:r>
+    </w:p>
+    <w:p>
+      <w:pPr>
+        <w:rPr>
+          <w:sz w:val="32"/>
+          <w:szCs w:val="32"/>
+          <w:lang w:val="en-US"/>
+        </w:rPr>
+      </w:pPr>
+      <w:r>
+        <w:rPr>
+          <w:sz w:val="32"/>
+          <w:szCs w:val="32"/>
+          <w:lang w:val="en-US"/>
+        </w:rPr>
+        <w:t>Haocheng: h_</w:t>
+      </w:r>
+      <w:r>
+        <w:rPr>
+          <w:rFonts w:hint="eastAsia"/>
+          <w:sz w:val="32"/>
+          <w:szCs w:val="32"/>
+          <w:lang w:val="en-US"/>
+        </w:rPr>
+        <w:t>xxxx</w:t>
+      </w:r>
+    </w:p>
+    <w:p>
+      <w:pPr>
+        <w:rPr>
+          <w:sz w:val="32"/>
+          <w:szCs w:val="32"/>
+          <w:lang w:val="en-US"/>
+        </w:rPr>
+      </w:pPr>
+      <w:r>
+        <w:rPr>
+          <w:sz w:val="32"/>
+          <w:szCs w:val="32"/>
+          <w:lang w:val="en-US"/>
+        </w:rPr>
+        <w:t>P</w:t>
+      </w:r>
+      <w:r>
+        <w:rPr>
+          <w:sz w:val="32"/>
+          <w:szCs w:val="32"/>
+          <w:lang w:val="en-US"/>
+        </w:rPr>
+        <w:t>e</w:t>
+      </w:r>
+      <w:r>
+        <w:rPr>
+          <w:sz w:val="32"/>
+          <w:szCs w:val="32"/>
+          <w:lang w:val="en-US"/>
+        </w:rPr>
+        <w:t>dro: p_xxxx</w:t>
+      </w:r>
+    </w:p>
+    <w:p>
+      <w:pPr>
+        <w:rPr>
+          <w:sz w:val="32"/>
+          <w:szCs w:val="32"/>
+          <w:lang w:val="en-US"/>
+        </w:rPr>
+      </w:pPr>
+      <w:r>
+        <w:rPr>
+          <w:sz w:val="32"/>
+          <w:szCs w:val="32"/>
+          <w:lang w:val="en-US"/>
+        </w:rPr>
+        <w:t>Mary: m_xxxx</w:t>
+      </w:r>
+    </w:p>
+    <w:p>
+      <w:pPr>
+        <w:rPr>
+          <w:sz w:val="32"/>
+          <w:szCs w:val="32"/>
+          <w:lang w:val="en-US"/>
+        </w:rPr>
+      </w:pPr>
+      <w:r>
+        <w:rPr>
+          <w:sz w:val="32"/>
+          <w:szCs w:val="32"/>
+          <w:lang w:val="en-US"/>
+        </w:rPr>
+        <w:t xml:space="preserve">CSS lib: </w:t>
+      </w:r>
+      <w:r>
+        <w:rPr>
+          <w:sz w:val="32"/>
+          <w:szCs w:val="32"/>
+          <w:lang w:val="en-US"/>
+        </w:rPr>
+        <w:t>B</w:t>
+      </w:r>
+      <w:r>
+        <w:rPr>
+          <w:sz w:val="32"/>
+          <w:szCs w:val="32"/>
+          <w:lang w:val="en-US"/>
+        </w:rPr>
+        <w:t>oo</w:t>
+      </w:r>
+      <w:r>
+        <w:rPr>
+          <w:sz w:val="32"/>
+          <w:szCs w:val="32"/>
+          <w:lang w:val="en-US"/>
+        </w:rPr>
+        <w:t>tS</w:t>
+      </w:r>
+      <w:r>
+        <w:rPr>
+          <w:sz w:val="32"/>
+          <w:szCs w:val="32"/>
+          <w:lang w:val="en-US"/>
+        </w:rPr>
+        <w:t>trap</w:t>
+      </w:r>
+    </w:p>
+    <w:p>
+      <w:pPr>
+        <w:rPr>
+          <w:sz w:val="32"/>
+          <w:szCs w:val="32"/>
+          <w:lang w:val="en-US"/>
+        </w:rPr>
+      </w:pPr>
+      <w:r>
+        <w:rPr>
+          <w:sz w:val="32"/>
+          <w:szCs w:val="32"/>
+          <w:lang w:val="en-US"/>
+        </w:rPr>
+        <w:t xml:space="preserve">Next </w:t>
+      </w:r>
+      <w:r>
+        <w:rPr>
+          <w:sz w:val="32"/>
+          <w:szCs w:val="32"/>
+          <w:lang w:val="en-US"/>
+        </w:rPr>
+        <w:t>meeting:</w:t>
+      </w:r>
+      <w:r>
+        <w:rPr>
+          <w:sz w:val="32"/>
+          <w:szCs w:val="32"/>
+          <w:lang w:val="en-US"/>
+        </w:rPr>
+        <w:t xml:space="preserve"> Monday 11 am</w:t>
+      </w:r>
+      <w:r>
+        <w:rPr>
+          <w:rFonts w:hint="eastAsia"/>
+          <w:sz w:val="32"/>
+          <w:szCs w:val="32"/>
+          <w:lang w:val="en-US"/>
+        </w:rPr>
+        <w:t>,</w:t>
+      </w:r>
+      <w:r>
+        <w:rPr>
+          <w:sz w:val="32"/>
+          <w:szCs w:val="32"/>
+          <w:lang w:val="en-US"/>
+        </w:rPr>
+        <w:t xml:space="preserve"> Nov 3</w:t>
+      </w:r>
+      <w:r>
+        <w:rPr>
+          <w:sz w:val="32"/>
+          <w:szCs w:val="32"/>
+          <w:vertAlign w:val="superscript"/>
+          <w:lang w:val="en-US"/>
+        </w:rPr>
+        <w:t>rd</w:t>
+      </w:r>
+      <w:r>
+        <w:rPr>
+          <w:sz w:val="32"/>
+          <w:szCs w:val="32"/>
+          <w:lang w:val="en-US"/>
+        </w:rPr>
+        <w:t>, 2025</w:t>
+      </w:r>
+    </w:p>
+    <w:p>
+      <w:pPr>
+        <w:rPr>
+          <w:sz w:val="32"/>
+          <w:szCs w:val="32"/>
+          <w:lang w:val="en-US"/>
+        </w:rPr>
+      </w:pPr>
+    </w:p>
+    <w:p>
+      <w:pPr>
+        <w:rPr>
+          <w:sz w:val="32"/>
+          <w:szCs w:val="32"/>
+        </w:rPr>
+      </w:pPr>
+    </w:p>
     <w:sectPr>
       <w:pgSz w:w="12240" w:h="15840"/>
       <w:pgMar w:top="1440" w:right="1440" w:bottom="1440" w:left="1440" w:header="720" w:footer="720" w:gutter="0"/>
@@ -424,6 +979,126 @@
     </w:sectPr>
   </w:body>
 </w:document>
+</file>
+
+<file path=word/numbering.xml><?xml version="1.0" encoding="utf-8"?>
+<w:numbering xmlns:wpc="http://schemas.microsoft.com/office/word/2010/wordprocessingCanvas" xmlns:cx="http://schemas.microsoft.com/office/drawing/2014/chartex" xmlns:cx1="http://schemas.microsoft.com/office/drawing/2015/9/8/chartex" xmlns:cx2="http://schemas.microsoft.com/office/drawing/2015/10/21/chartex" xmlns:cx3="http://schemas.microsoft.com/office/drawing/2016/5/9/chartex" xmlns:cx4="http://schemas.microsoft.com/office/drawing/2016/5/10/chartex" xmlns:cx5="http://schemas.microsoft.com/office/drawing/2016/5/11/chartex" xmlns:cx6="http://schemas.microsoft.com/office/drawing/2016/5/12/chartex" xmlns:cx7="http://schemas.microsoft.com/office/drawing/2016/5/13/chartex" xmlns:cx8="http://schemas.microsoft.com/office/drawing/2016/5/14/chartex" xmlns:mc="http://schemas.openxmlformats.org/markup-compatibility/2006" xmlns:aink="http://schemas.microsoft.com/office/drawing/2016/ink" xmlns:am3d="http://schemas.microsoft.com/office/drawing/2017/model3d" xmlns:o="urn:schemas-microsoft-com:office:office" xmlns:oel="http://schemas.microsoft.com/office/2019/extlst" xmlns:r="http://schemas.openxmlformats.org/officeDocument/2006/relationships" xmlns:m="http://schemas.openxmlformats.org/officeDocument/2006/math" xmlns:v="urn:schemas-microsoft-com:vml" xmlns:wp14="http://schemas.microsoft.com/office/word/2010/wordprocessingDrawing" xmlns:wp="http://schemas.openxmlformats.org/drawingml/2006/wordprocessingDrawing" xmlns:w10="urn:schemas-microsoft-com:office:word" xmlns:w="http://schemas.openxmlformats.org/wordprocessingml/2006/main" xmlns:w14="http://schemas.microsoft.com/office/word/2010/wordml" xmlns:w15="http://schemas.microsoft.com/office/word/2012/wordml" xmlns:w16cex="http://schemas.microsoft.com/office/word/2018/wordml/cex" xmlns:w16cid="http://schemas.microsoft.com/office/word/2016/wordml/cid" xmlns:w16="http://schemas.microsoft.com/office/word/2018/wordml" xmlns:w16du="http://schemas.microsoft.com/office/word/2023/wordml/word16du" xmlns:w16sdtdh="http://schemas.microsoft.com/office/word/2020/wordml/sdtdatahash" xmlns:w16sdtfl="http://schemas.microsoft.com/office/word/2024/wordml/sdtformatlock" xmlns:w16se="http://schemas.microsoft.com/office/word/2015/wordml/symex" xmlns:wpg="http://schemas.microsoft.com/office/word/2010/wordprocessingGroup" xmlns:wpi="http://schemas.microsoft.com/office/word/2010/wordprocessingInk" xmlns:wne="http://schemas.microsoft.com/office/word/2006/wordml" xmlns:wps="http://schemas.microsoft.com/office/word/2010/wordprocessingShape" mc:Ignorable="w14 w15 w16se w16cid w16 w16cex w16sdtdh w16sdtfl w16du wp14">
+  <w:abstractNum w:abstractNumId="0" w15:restartNumberingAfterBreak="0">
+    <w:nsid w:val="6F600818"/>
+    <w:multiLevelType w:val="hybridMultilevel"/>
+    <w:tmpl w:val="D7345E9E"/>
+    <w:lvl w:ilvl="0" w:tplc="D3026B04">
+      <w:numFmt w:val="bullet"/>
+      <w:lvlText w:val="-"/>
+      <w:lvlJc w:val="left"/>
+      <w:pPr>
+        <w:ind w:left="720" w:hanging="360"/>
+      </w:pPr>
+      <w:rPr>
+        <w:rFonts w:ascii="Aptos" w:eastAsiaTheme="minorEastAsia" w:hAnsi="Aptos" w:cstheme="minorBidi" w:hint="default"/>
+      </w:rPr>
+    </w:lvl>
+    <w:lvl w:ilvl="1" w:tplc="10090003" w:tentative="1">
+      <w:start w:val="1"/>
+      <w:numFmt w:val="bullet"/>
+      <w:lvlText w:val="o"/>
+      <w:lvlJc w:val="left"/>
+      <w:pPr>
+        <w:ind w:left="1440" w:hanging="360"/>
+      </w:pPr>
+      <w:rPr>
+        <w:rFonts w:ascii="Courier New" w:hAnsi="Courier New" w:cs="Courier New" w:hint="default"/>
+      </w:rPr>
+    </w:lvl>
+    <w:lvl w:ilvl="2" w:tplc="10090005" w:tentative="1">
+      <w:start w:val="1"/>
+      <w:numFmt w:val="bullet"/>
+      <w:lvlText w:val=""/>
+      <w:lvlJc w:val="left"/>
+      <w:pPr>
+        <w:ind w:left="2160" w:hanging="360"/>
+      </w:pPr>
+      <w:rPr>
+        <w:rFonts w:ascii="Wingdings" w:hAnsi="Wingdings" w:hint="default"/>
+      </w:rPr>
+    </w:lvl>
+    <w:lvl w:ilvl="3" w:tplc="10090001" w:tentative="1">
+      <w:start w:val="1"/>
+      <w:numFmt w:val="bullet"/>
+      <w:lvlText w:val=""/>
+      <w:lvlJc w:val="left"/>
+      <w:pPr>
+        <w:ind w:left="2880" w:hanging="360"/>
+      </w:pPr>
+      <w:rPr>
+        <w:rFonts w:ascii="Symbol" w:hAnsi="Symbol" w:hint="default"/>
+      </w:rPr>
+    </w:lvl>
+    <w:lvl w:ilvl="4" w:tplc="10090003" w:tentative="1">
+      <w:start w:val="1"/>
+      <w:numFmt w:val="bullet"/>
+      <w:lvlText w:val="o"/>
+      <w:lvlJc w:val="left"/>
+      <w:pPr>
+        <w:ind w:left="3600" w:hanging="360"/>
+      </w:pPr>
+      <w:rPr>
+        <w:rFonts w:ascii="Courier New" w:hAnsi="Courier New" w:cs="Courier New" w:hint="default"/>
+      </w:rPr>
+    </w:lvl>
+    <w:lvl w:ilvl="5" w:tplc="10090005" w:tentative="1">
+      <w:start w:val="1"/>
+      <w:numFmt w:val="bullet"/>
+      <w:lvlText w:val=""/>
+      <w:lvlJc w:val="left"/>
+      <w:pPr>
+        <w:ind w:left="4320" w:hanging="360"/>
+      </w:pPr>
+      <w:rPr>
+        <w:rFonts w:ascii="Wingdings" w:hAnsi="Wingdings" w:hint="default"/>
+      </w:rPr>
+    </w:lvl>
+    <w:lvl w:ilvl="6" w:tplc="10090001" w:tentative="1">
+      <w:start w:val="1"/>
+      <w:numFmt w:val="bullet"/>
+      <w:lvlText w:val=""/>
+      <w:lvlJc w:val="left"/>
+      <w:pPr>
+        <w:ind w:left="5040" w:hanging="360"/>
+      </w:pPr>
+      <w:rPr>
+        <w:rFonts w:ascii="Symbol" w:hAnsi="Symbol" w:hint="default"/>
+      </w:rPr>
+    </w:lvl>
+    <w:lvl w:ilvl="7" w:tplc="10090003" w:tentative="1">
+      <w:start w:val="1"/>
+      <w:numFmt w:val="bullet"/>
+      <w:lvlText w:val="o"/>
+      <w:lvlJc w:val="left"/>
+      <w:pPr>
+        <w:ind w:left="5760" w:hanging="360"/>
+      </w:pPr>
+      <w:rPr>
+        <w:rFonts w:ascii="Courier New" w:hAnsi="Courier New" w:cs="Courier New" w:hint="default"/>
+      </w:rPr>
+    </w:lvl>
+    <w:lvl w:ilvl="8" w:tplc="10090005" w:tentative="1">
+      <w:start w:val="1"/>
+      <w:numFmt w:val="bullet"/>
+      <w:lvlText w:val=""/>
+      <w:lvlJc w:val="left"/>
+      <w:pPr>
+        <w:ind w:left="6480" w:hanging="360"/>
+      </w:pPr>
+      <w:rPr>
+        <w:rFonts w:ascii="Wingdings" w:hAnsi="Wingdings" w:hint="default"/>
+      </w:rPr>
+    </w:lvl>
+  </w:abstractNum>
+  <w:num w:numId="1" w16cid:durableId="134104437">
+    <w:abstractNumId w:val="0"/>
+  </w:num>
+</w:numbering>
 </file>
 
 <file path=word/styles.xml><?xml version="1.0" encoding="utf-8"?>

</xml_diff>

<commit_message>
style the typography to match the aimed styling
</commit_message>
<xml_diff>
--- a/project1/meetingContent.docx
+++ b/project1/meetingContent.docx
@@ -208,7 +208,7 @@
             <v:path o:extrusionok="f" gradientshapeok="t" o:connecttype="rect"/>
             <o:lock v:ext="edit" aspectratio="t"/>
           </v:shapetype>
-          <v:shape id="_x0000_i1025" type="#_x0000_t75" style="width:74.1pt;height:49.8pt" o:ole="">
+          <v:shape id="_x0000_i1025" type="#_x0000_t75" style="width:74pt;height:50pt" o:ole="">
             <v:imagedata r:id="rId6" o:title=""/>
           </v:shape>
           <o:OLEObject Type="Link" ProgID="Excel.Sheet.12" ShapeID="_x0000_i1025" DrawAspect="Content" r:id="rId7" UpdateMode="Always">
@@ -968,6 +968,303 @@
         <w:rPr>
           <w:sz w:val="32"/>
           <w:szCs w:val="32"/>
+          <w:lang w:val="en-US"/>
+        </w:rPr>
+      </w:pPr>
+    </w:p>
+    <w:p>
+      <w:pPr>
+        <w:rPr>
+          <w:sz w:val="32"/>
+          <w:szCs w:val="32"/>
+          <w:lang w:val="en-US"/>
+        </w:rPr>
+      </w:pPr>
+      <w:r>
+        <w:rPr>
+          <w:sz w:val="32"/>
+          <w:szCs w:val="32"/>
+          <w:lang w:val="en-US"/>
+        </w:rPr>
+        <w:t>Meeting content:</w:t>
+      </w:r>
+    </w:p>
+    <w:p>
+      <w:pPr>
+        <w:rPr>
+          <w:sz w:val="32"/>
+          <w:szCs w:val="32"/>
+          <w:lang w:val="en-US"/>
+        </w:rPr>
+      </w:pPr>
+      <w:r>
+        <w:rPr>
+          <w:sz w:val="32"/>
+          <w:szCs w:val="32"/>
+          <w:lang w:val="en-US"/>
+        </w:rPr>
+        <w:t>Monday 11 am, Nov 3, 2025</w:t>
+      </w:r>
+    </w:p>
+    <w:p>
+      <w:pPr>
+        <w:rPr>
+          <w:sz w:val="32"/>
+          <w:szCs w:val="32"/>
+          <w:lang w:val="en-US"/>
+        </w:rPr>
+      </w:pPr>
+      <w:r>
+        <w:rPr>
+          <w:sz w:val="32"/>
+          <w:szCs w:val="32"/>
+          <w:lang w:val="en-US"/>
+        </w:rPr>
+        <w:t xml:space="preserve"> </w:t>
+      </w:r>
+    </w:p>
+    <w:p>
+      <w:pPr>
+        <w:rPr>
+          <w:sz w:val="32"/>
+          <w:szCs w:val="32"/>
+          <w:lang w:val="en-US"/>
+        </w:rPr>
+      </w:pPr>
+      <w:r>
+        <w:rPr>
+          <w:sz w:val="32"/>
+          <w:szCs w:val="32"/>
+          <w:lang w:val="en-US"/>
+        </w:rPr>
+        <w:t xml:space="preserve">Todo: </w:t>
+      </w:r>
+    </w:p>
+    <w:p>
+      <w:pPr>
+        <w:rPr>
+          <w:sz w:val="32"/>
+          <w:szCs w:val="32"/>
+        </w:rPr>
+      </w:pPr>
+      <w:r>
+        <w:rPr>
+          <w:sz w:val="32"/>
+          <w:szCs w:val="32"/>
+          <w:lang w:val="en-US"/>
+        </w:rPr>
+        <w:t xml:space="preserve">Haocheng:  </w:t>
+      </w:r>
+      <w:r>
+        <w:rPr>
+          <w:sz w:val="32"/>
+          <w:szCs w:val="32"/>
+        </w:rPr>
+        <w:t>You should create at least 1 chart that has button/radio/checkbox to update the chart style (CSS)</w:t>
+      </w:r>
+      <w:r>
+        <w:rPr>
+          <w:sz w:val="32"/>
+          <w:szCs w:val="32"/>
+        </w:rPr>
+        <w:t xml:space="preserve"> =&gt; solution: add a Toggle button at the top of the Image for the UI Lib (without functionality, only for UI look and feels)</w:t>
+      </w:r>
+    </w:p>
+    <w:p>
+      <w:pPr>
+        <w:rPr>
+          <w:sz w:val="32"/>
+          <w:szCs w:val="32"/>
+        </w:rPr>
+      </w:pPr>
+      <w:r>
+        <w:rPr>
+          <w:sz w:val="32"/>
+          <w:szCs w:val="32"/>
+        </w:rPr>
+        <w:t xml:space="preserve">Modify the </w:t>
+      </w:r>
+      <w:r>
+        <w:rPr>
+          <w:sz w:val="32"/>
+          <w:szCs w:val="32"/>
+        </w:rPr>
+        <w:drawing>
+          <wp:inline distT="0" distB="0" distL="0" distR="0" wp14:anchorId="535B990B" wp14:editId="06BC4AF0">
+            <wp:extent cx="2330570" cy="1143059"/>
+            <wp:effectExtent l="0" t="0" r="0" b="0"/>
+            <wp:docPr id="641789347" name="Picture 1" descr="A close up of a number&#10;&#10;AI-generated content may be incorrect."/>
+            <wp:cNvGraphicFramePr>
+              <a:graphicFrameLocks xmlns:a="http://schemas.openxmlformats.org/drawingml/2006/main" noChangeAspect="1"/>
+            </wp:cNvGraphicFramePr>
+            <a:graphic xmlns:a="http://schemas.openxmlformats.org/drawingml/2006/main">
+              <a:graphicData uri="http://schemas.openxmlformats.org/drawingml/2006/picture">
+                <pic:pic xmlns:pic="http://schemas.openxmlformats.org/drawingml/2006/picture">
+                  <pic:nvPicPr>
+                    <pic:cNvPr id="641789347" name="Picture 1" descr="A close up of a number&#10;&#10;AI-generated content may be incorrect."/>
+                    <pic:cNvPicPr/>
+                  </pic:nvPicPr>
+                  <pic:blipFill>
+                    <a:blip r:embed="rId9"/>
+                    <a:stretch>
+                      <a:fillRect/>
+                    </a:stretch>
+                  </pic:blipFill>
+                  <pic:spPr>
+                    <a:xfrm>
+                      <a:off x="0" y="0"/>
+                      <a:ext cx="2330570" cy="1143059"/>
+                    </a:xfrm>
+                    <a:prstGeom prst="rect">
+                      <a:avLst/>
+                    </a:prstGeom>
+                  </pic:spPr>
+                </pic:pic>
+              </a:graphicData>
+            </a:graphic>
+          </wp:inline>
+        </w:drawing>
+      </w:r>
+      <w:r>
+        <w:rPr>
+          <w:sz w:val="32"/>
+          <w:szCs w:val="32"/>
+        </w:rPr>
+        <w:t xml:space="preserve"> </w:t>
+      </w:r>
+      <w:r>
+        <w:rPr>
+          <w:sz w:val="32"/>
+          <w:szCs w:val="32"/>
+        </w:rPr>
+        <w:t xml:space="preserve">  ‘</w:t>
+      </w:r>
+      <w:r>
+        <w:rPr>
+          <w:sz w:val="32"/>
+          <w:szCs w:val="32"/>
+        </w:rPr>
+        <w:t>/ 40px</w:t>
+      </w:r>
+      <w:r>
+        <w:rPr>
+          <w:sz w:val="32"/>
+          <w:szCs w:val="32"/>
+        </w:rPr>
+        <w:t>’</w:t>
+      </w:r>
+      <w:r>
+        <w:rPr>
+          <w:sz w:val="32"/>
+          <w:szCs w:val="32"/>
+        </w:rPr>
+        <w:t xml:space="preserve"> into weights at index.html</w:t>
+      </w:r>
+    </w:p>
+    <w:p>
+      <w:pPr>
+        <w:rPr>
+          <w:sz w:val="32"/>
+          <w:szCs w:val="32"/>
+        </w:rPr>
+      </w:pPr>
+      <w:r>
+        <w:rPr>
+          <w:sz w:val="32"/>
+          <w:szCs w:val="32"/>
+        </w:rPr>
+        <w:t xml:space="preserve">Double check the html css code is matching the style to should be </w:t>
+      </w:r>
+    </w:p>
+    <w:p>
+      <w:pPr>
+        <w:rPr>
+          <w:sz w:val="32"/>
+          <w:szCs w:val="32"/>
+        </w:rPr>
+      </w:pPr>
+    </w:p>
+    <w:p>
+      <w:pPr>
+        <w:rPr>
+          <w:sz w:val="32"/>
+          <w:szCs w:val="32"/>
+        </w:rPr>
+      </w:pPr>
+      <w:r>
+        <w:rPr>
+          <w:sz w:val="32"/>
+          <w:szCs w:val="32"/>
+        </w:rPr>
+        <w:lastRenderedPageBreak/>
+        <w:t xml:space="preserve">Mary: add a pie chart and </w:t>
+      </w:r>
+      <w:r>
+        <w:rPr>
+          <w:sz w:val="32"/>
+          <w:szCs w:val="32"/>
+        </w:rPr>
+        <w:t>area chart</w:t>
+      </w:r>
+      <w:r>
+        <w:rPr>
+          <w:sz w:val="32"/>
+          <w:szCs w:val="32"/>
+        </w:rPr>
+        <w:t>, get the total number of users,</w:t>
+      </w:r>
+    </w:p>
+    <w:p>
+      <w:pPr>
+        <w:rPr>
+          <w:sz w:val="32"/>
+          <w:szCs w:val="32"/>
+        </w:rPr>
+      </w:pPr>
+      <w:r>
+        <w:rPr>
+          <w:sz w:val="32"/>
+          <w:szCs w:val="32"/>
+        </w:rPr>
+        <w:t>Get the total amount of revenue</w:t>
+      </w:r>
+      <w:r>
+        <w:rPr>
+          <w:sz w:val="32"/>
+          <w:szCs w:val="32"/>
+        </w:rPr>
+        <w:t>.</w:t>
+      </w:r>
+    </w:p>
+    <w:p>
+      <w:pPr>
+        <w:rPr>
+          <w:sz w:val="32"/>
+          <w:szCs w:val="32"/>
+        </w:rPr>
+      </w:pPr>
+    </w:p>
+    <w:p>
+      <w:pPr>
+        <w:rPr>
+          <w:sz w:val="32"/>
+          <w:szCs w:val="32"/>
+        </w:rPr>
+      </w:pPr>
+      <w:r>
+        <w:rPr>
+          <w:sz w:val="32"/>
+          <w:szCs w:val="32"/>
+        </w:rPr>
+        <w:t>Next meeting:  TO be determined</w:t>
+      </w:r>
+    </w:p>
+    <w:p>
+      <w:pPr>
+        <w:rPr>
+          <w:sz w:val="32"/>
+          <w:szCs w:val="32"/>
+          <w:lang w:val="en-US"/>
         </w:rPr>
       </w:pPr>
     </w:p>
@@ -1704,7 +2001,6 @@
   <w:style w:type="character" w:default="1" w:styleId="DefaultParagraphFont">
     <w:name w:val="Default Paragraph Font"/>
     <w:uiPriority w:val="1"/>
-    <w:semiHidden/>
     <w:unhideWhenUsed/>
   </w:style>
   <w:style w:type="table" w:default="1" w:styleId="TableNormal">

</xml_diff>

<commit_message>
Add top 100 YouTubers data and initial requirements document
- Created a new CSV file containing data for the top 100 YouTubers, including details such as country, channel name, category, followers, engagement rates, and income.
- Added a new Word document for the requirements related to the Customer B chart project.
</commit_message>
<xml_diff>
--- a/project1/meetingContent.docx
+++ b/project1/meetingContent.docx
@@ -144,7 +144,25 @@
             <w:szCs w:val="28"/>
             <w:lang w:val="en-US"/>
           </w:rPr>
-          <w:t>https://www.figma.com/make/dg1kxBP3l6cAlsIuKOib5Y/Data-Dashboard-UI-Pattern-Library?node-id=0-1&amp;t=Gno28ymgATEBSoCH-1</w:t>
+          <w:t>https://www.figma.c</w:t>
+        </w:r>
+        <w:r>
+          <w:rPr>
+            <w:rStyle w:val="Hyperlink"/>
+            <w:sz w:val="28"/>
+            <w:szCs w:val="28"/>
+            <w:lang w:val="en-US"/>
+          </w:rPr>
+          <w:t>o</w:t>
+        </w:r>
+        <w:r>
+          <w:rPr>
+            <w:rStyle w:val="Hyperlink"/>
+            <w:sz w:val="28"/>
+            <w:szCs w:val="28"/>
+            <w:lang w:val="en-US"/>
+          </w:rPr>
+          <w:t>m/make/dg1kxBP3l6cAlsIuKOib5Y/Data-Dashboard-UI-Pattern-Library?node-id=0-1&amp;t=Gno28ymgATEBSoCH-1</w:t>
         </w:r>
       </w:hyperlink>
     </w:p>
@@ -182,6 +200,46 @@
           <w:lang w:val="en-US"/>
         </w:rPr>
       </w:pPr>
+      <w:r>
+        <w:rPr>
+          <w:sz w:val="28"/>
+          <w:szCs w:val="28"/>
+          <w:lang w:val="en-US"/>
+        </w:rPr>
+        <w:fldChar w:fldCharType="begin"/>
+      </w:r>
+      <w:r>
+        <w:rPr>
+          <w:sz w:val="28"/>
+          <w:szCs w:val="28"/>
+          <w:lang w:val="en-US"/>
+        </w:rPr>
+        <w:instrText xml:space="preserve"> LINK </w:instrText>
+      </w:r>
+      <w:r>
+        <w:rPr>
+          <w:sz w:val="28"/>
+          <w:szCs w:val="28"/>
+          <w:lang w:val="en-US"/>
+        </w:rPr>
+        <w:instrText xml:space="preserve"> "D:\\fanshawe college\\3171_UI&amp;DataVisualization\\projects\\Info_3171_group_project\\project1\\Libray Color Options.xlsx"  </w:instrText>
+      </w:r>
+      <w:r>
+        <w:rPr>
+          <w:sz w:val="28"/>
+          <w:szCs w:val="28"/>
+          <w:lang w:val="en-US"/>
+        </w:rPr>
+        <w:instrText xml:space="preserve">\a \p \f 0 \* MERGEFORMAT </w:instrText>
+      </w:r>
+      <w:r>
+        <w:rPr>
+          <w:sz w:val="28"/>
+          <w:szCs w:val="28"/>
+          <w:lang w:val="en-US"/>
+        </w:rPr>
+        <w:fldChar w:fldCharType="separate"/>
+      </w:r>
       <w:r>
         <w:rPr>
           <w:sz w:val="28"/>
@@ -211,12 +269,15 @@
           <v:shape id="_x0000_i1025" type="#_x0000_t75" style="width:74pt;height:50pt" o:ole="">
             <v:imagedata r:id="rId6" o:title=""/>
           </v:shape>
-          <o:OLEObject Type="Link" ProgID="Excel.Sheet.12" ShapeID="_x0000_i1025" DrawAspect="Content" r:id="rId7" UpdateMode="Always">
-            <o:LinkType>EnhancedMetaFile</o:LinkType>
-            <o:LockedField>false</o:LockedField>
-            <o:FieldCodes>\f 0 \* MERGEFORMAT</o:FieldCodes>
-          </o:OLEObject>
         </w:object>
+      </w:r>
+      <w:r>
+        <w:rPr>
+          <w:sz w:val="28"/>
+          <w:szCs w:val="28"/>
+          <w:lang w:val="en-US"/>
+        </w:rPr>
+        <w:fldChar w:fldCharType="end"/>
       </w:r>
     </w:p>
     <w:p>
@@ -310,7 +371,7 @@
                     <pic:cNvPicPr/>
                   </pic:nvPicPr>
                   <pic:blipFill>
-                    <a:blip r:embed="rId8"/>
+                    <a:blip r:embed="rId7"/>
                     <a:stretch>
                       <a:fillRect/>
                     </a:stretch>
@@ -776,7 +837,16 @@
           <w:szCs w:val="32"/>
           <w:lang w:val="en-US"/>
         </w:rPr>
-        <w:t>Haocheng: h_</w:t>
+        <w:t xml:space="preserve">Haocheng: </w:t>
+      </w:r>
+      <w:proofErr w:type="spellStart"/>
+      <w:r>
+        <w:rPr>
+          <w:sz w:val="32"/>
+          <w:szCs w:val="32"/>
+          <w:lang w:val="en-US"/>
+        </w:rPr>
+        <w:t>h_</w:t>
       </w:r>
       <w:r>
         <w:rPr>
@@ -787,6 +857,7 @@
         </w:rPr>
         <w:t>xxxx</w:t>
       </w:r>
+      <w:proofErr w:type="spellEnd"/>
     </w:p>
     <w:p>
       <w:pPr>
@@ -818,25 +889,45 @@
           <w:szCs w:val="32"/>
           <w:lang w:val="en-US"/>
         </w:rPr>
-        <w:t>dro: p_xxxx</w:t>
-      </w:r>
-    </w:p>
-    <w:p>
-      <w:pPr>
-        <w:rPr>
-          <w:sz w:val="32"/>
-          <w:szCs w:val="32"/>
-          <w:lang w:val="en-US"/>
-        </w:rPr>
-      </w:pPr>
-      <w:r>
-        <w:rPr>
-          <w:sz w:val="32"/>
-          <w:szCs w:val="32"/>
-          <w:lang w:val="en-US"/>
-        </w:rPr>
-        <w:t>Mary: m_xxxx</w:t>
-      </w:r>
+        <w:t xml:space="preserve">dro: </w:t>
+      </w:r>
+      <w:proofErr w:type="spellStart"/>
+      <w:r>
+        <w:rPr>
+          <w:sz w:val="32"/>
+          <w:szCs w:val="32"/>
+          <w:lang w:val="en-US"/>
+        </w:rPr>
+        <w:t>p_xxxx</w:t>
+      </w:r>
+      <w:proofErr w:type="spellEnd"/>
+    </w:p>
+    <w:p>
+      <w:pPr>
+        <w:rPr>
+          <w:sz w:val="32"/>
+          <w:szCs w:val="32"/>
+          <w:lang w:val="en-US"/>
+        </w:rPr>
+      </w:pPr>
+      <w:r>
+        <w:rPr>
+          <w:sz w:val="32"/>
+          <w:szCs w:val="32"/>
+          <w:lang w:val="en-US"/>
+        </w:rPr>
+        <w:t xml:space="preserve">Mary: </w:t>
+      </w:r>
+      <w:proofErr w:type="spellStart"/>
+      <w:r>
+        <w:rPr>
+          <w:sz w:val="32"/>
+          <w:szCs w:val="32"/>
+          <w:lang w:val="en-US"/>
+        </w:rPr>
+        <w:t>m_xxxx</w:t>
+      </w:r>
+      <w:proofErr w:type="spellEnd"/>
     </w:p>
     <w:p>
       <w:pPr>
@@ -854,6 +945,7 @@
         </w:rPr>
         <w:t xml:space="preserve">CSS lib: </w:t>
       </w:r>
+      <w:proofErr w:type="spellStart"/>
       <w:r>
         <w:rPr>
           <w:sz w:val="32"/>
@@ -886,6 +978,7 @@
         </w:rPr>
         <w:t>trap</w:t>
       </w:r>
+      <w:proofErr w:type="spellEnd"/>
     </w:p>
     <w:p>
       <w:pPr>
@@ -1086,6 +1179,7 @@
       </w:r>
       <w:r>
         <w:rPr>
+          <w:noProof/>
           <w:sz w:val="32"/>
           <w:szCs w:val="32"/>
         </w:rPr>
@@ -1105,7 +1199,7 @@
                     <pic:cNvPicPr/>
                   </pic:nvPicPr>
                   <pic:blipFill>
-                    <a:blip r:embed="rId9"/>
+                    <a:blip r:embed="rId8"/>
                     <a:stretch>
                       <a:fillRect/>
                     </a:stretch>
@@ -1173,7 +1267,23 @@
           <w:sz w:val="32"/>
           <w:szCs w:val="32"/>
         </w:rPr>
-        <w:t xml:space="preserve">Double check the html css code is matching the style to should be </w:t>
+        <w:t xml:space="preserve">Double check the html </w:t>
+      </w:r>
+      <w:proofErr w:type="spellStart"/>
+      <w:r>
+        <w:rPr>
+          <w:sz w:val="32"/>
+          <w:szCs w:val="32"/>
+        </w:rPr>
+        <w:t>css</w:t>
+      </w:r>
+      <w:proofErr w:type="spellEnd"/>
+      <w:r>
+        <w:rPr>
+          <w:sz w:val="32"/>
+          <w:szCs w:val="32"/>
+        </w:rPr>
+        <w:t xml:space="preserve"> code is matching the style to should be </w:t>
       </w:r>
     </w:p>
     <w:p>
@@ -1265,6 +1375,242 @@
           <w:sz w:val="32"/>
           <w:szCs w:val="32"/>
           <w:lang w:val="en-US"/>
+        </w:rPr>
+      </w:pPr>
+    </w:p>
+    <w:p>
+      <w:pPr>
+        <w:rPr>
+          <w:sz w:val="32"/>
+          <w:szCs w:val="32"/>
+          <w:lang w:val="en-US"/>
+        </w:rPr>
+      </w:pPr>
+    </w:p>
+    <w:p>
+      <w:pPr>
+        <w:rPr>
+          <w:sz w:val="32"/>
+          <w:szCs w:val="32"/>
+          <w:lang w:val="en-US"/>
+        </w:rPr>
+      </w:pPr>
+    </w:p>
+    <w:p>
+      <w:pPr>
+        <w:rPr>
+          <w:sz w:val="32"/>
+          <w:szCs w:val="32"/>
+          <w:lang w:val="en-US"/>
+        </w:rPr>
+      </w:pPr>
+      <w:r>
+        <w:rPr>
+          <w:sz w:val="32"/>
+          <w:szCs w:val="32"/>
+          <w:lang w:val="en-US"/>
+        </w:rPr>
+        <w:t>NOV,10,2025</w:t>
+      </w:r>
+    </w:p>
+    <w:p>
+      <w:pPr>
+        <w:rPr>
+          <w:sz w:val="32"/>
+          <w:szCs w:val="32"/>
+          <w:lang w:val="en-US"/>
+        </w:rPr>
+      </w:pPr>
+      <w:r>
+        <w:rPr>
+          <w:sz w:val="32"/>
+          <w:szCs w:val="32"/>
+          <w:lang w:val="en-US"/>
+        </w:rPr>
+        <w:t>Todo:</w:t>
+      </w:r>
+    </w:p>
+    <w:p>
+      <w:pPr>
+        <w:rPr>
+          <w:sz w:val="32"/>
+          <w:szCs w:val="32"/>
+          <w:lang w:val="en-US"/>
+        </w:rPr>
+      </w:pPr>
+      <w:r>
+        <w:rPr>
+          <w:sz w:val="32"/>
+          <w:szCs w:val="32"/>
+          <w:lang w:val="en-US"/>
+        </w:rPr>
+        <w:t xml:space="preserve">Pedro: ask professor about the loading data method, using XAMPP or d3.csv </w:t>
+      </w:r>
+      <w:proofErr w:type="spellStart"/>
+      <w:r>
+        <w:rPr>
+          <w:sz w:val="32"/>
+          <w:szCs w:val="32"/>
+          <w:lang w:val="en-US"/>
+        </w:rPr>
+        <w:t>api</w:t>
+      </w:r>
+      <w:proofErr w:type="spellEnd"/>
+      <w:r>
+        <w:rPr>
+          <w:sz w:val="32"/>
+          <w:szCs w:val="32"/>
+          <w:lang w:val="en-US"/>
+        </w:rPr>
+        <w:t>?</w:t>
+      </w:r>
+      <w:r>
+        <w:rPr>
+          <w:sz w:val="32"/>
+          <w:szCs w:val="32"/>
+          <w:lang w:val="en-US"/>
+        </w:rPr>
+        <w:t xml:space="preserve"> </w:t>
+      </w:r>
+    </w:p>
+    <w:p>
+      <w:pPr>
+        <w:rPr>
+          <w:sz w:val="32"/>
+          <w:szCs w:val="32"/>
+        </w:rPr>
+      </w:pPr>
+      <w:r>
+        <w:rPr>
+          <w:sz w:val="32"/>
+          <w:szCs w:val="32"/>
+        </w:rPr>
+        <w:t>10. You must include the template link you used in your submission comment.</w:t>
+      </w:r>
+    </w:p>
+    <w:p>
+      <w:pPr>
+        <w:rPr>
+          <w:sz w:val="32"/>
+          <w:szCs w:val="32"/>
+          <w:lang w:val="en-US"/>
+        </w:rPr>
+      </w:pPr>
+      <w:r>
+        <w:rPr>
+          <w:sz w:val="32"/>
+          <w:szCs w:val="32"/>
+          <w:lang w:val="en-US"/>
+        </w:rPr>
+        <w:t>Ask: can we rename the chart title she gives, like shorten the chart title</w:t>
+      </w:r>
+    </w:p>
+    <w:p>
+      <w:pPr>
+        <w:rPr>
+          <w:sz w:val="32"/>
+          <w:szCs w:val="32"/>
+          <w:lang w:val="en-US"/>
+        </w:rPr>
+      </w:pPr>
+      <w:r>
+        <w:rPr>
+          <w:sz w:val="32"/>
+          <w:szCs w:val="32"/>
+          <w:lang w:val="en-US"/>
+        </w:rPr>
+        <w:t xml:space="preserve">Haocheng: ADD Icons </w:t>
+      </w:r>
+      <w:r>
+        <w:rPr>
+          <w:sz w:val="32"/>
+          <w:szCs w:val="32"/>
+          <w:lang w:val="en-US"/>
+        </w:rPr>
+        <w:t>at</w:t>
+      </w:r>
+      <w:r>
+        <w:rPr>
+          <w:sz w:val="32"/>
+          <w:szCs w:val="32"/>
+          <w:lang w:val="en-US"/>
+        </w:rPr>
+        <w:t xml:space="preserve"> the dashboard</w:t>
+      </w:r>
+      <w:r>
+        <w:rPr>
+          <w:sz w:val="32"/>
+          <w:szCs w:val="32"/>
+          <w:lang w:val="en-US"/>
+        </w:rPr>
+        <w:t>. Make the images same height and width</w:t>
+      </w:r>
+      <w:r>
+        <w:rPr>
+          <w:sz w:val="32"/>
+          <w:szCs w:val="32"/>
+          <w:lang w:val="en-US"/>
+        </w:rPr>
+        <w:t>.</w:t>
+      </w:r>
+    </w:p>
+    <w:p>
+      <w:pPr>
+        <w:rPr>
+          <w:sz w:val="32"/>
+          <w:szCs w:val="32"/>
+          <w:lang w:val="en-US"/>
+        </w:rPr>
+      </w:pPr>
+    </w:p>
+    <w:p>
+      <w:r>
+        <w:t>Charts assignment</w:t>
+      </w:r>
+    </w:p>
+    <w:p>
+      <w:r>
+        <w:t>Haocheng (6 8 9)</w:t>
+      </w:r>
+    </w:p>
+    <w:p>
+      <w:r>
+        <w:t xml:space="preserve">Mary: (1,2) </w:t>
+      </w:r>
+    </w:p>
+    <w:p>
+      <w:r>
+        <w:t xml:space="preserve">Tarun (3,4) </w:t>
+      </w:r>
+    </w:p>
+    <w:p>
+      <w:r>
+        <w:t xml:space="preserve"> Pedro (5,7)</w:t>
+      </w:r>
+    </w:p>
+    <w:p/>
+    <w:p>
+      <w:r>
+        <w:t>Next meeting : 11am Nov,18</w:t>
+      </w:r>
+      <w:r>
+        <w:rPr>
+          <w:vertAlign w:val="superscript"/>
+        </w:rPr>
+        <w:t>th</w:t>
+      </w:r>
+      <w:r>
+        <w:rPr>
+          <w:vertAlign w:val="superscript"/>
+        </w:rPr>
+        <w:t xml:space="preserve"> </w:t>
+      </w:r>
+    </w:p>
+    <w:p>
+      <w:pPr>
+        <w:rPr>
+          <w:sz w:val="32"/>
+          <w:szCs w:val="32"/>
         </w:rPr>
       </w:pPr>
     </w:p>

</xml_diff>